<commit_message>
fix: remove extra bracket in template
</commit_message>
<xml_diff>
--- a/templates/sell_exclusive.docx
+++ b/templates/sell_exclusive.docx
@@ -462,16 +462,7 @@
                 <w:sz w:val="19"/>
                 <w:szCs w:val="19"/>
               </w:rPr>
-              <w:t>/                    /</w:t>
-            </w:r>
-            <w:r>
-              <w:rPr>
-                <w:rFonts w:ascii="Tahoma" w:hAnsi="Tahoma" w:cs="Tahoma"/>
-                <w:sz w:val="19"/>
-                <w:szCs w:val="19"/>
-                <w:lang w:val="mn-MN"/>
-              </w:rPr>
-              <w:t xml:space="preserve"> </w:t>
+              <w:t xml:space="preserve">                  </w:t>
             </w:r>
             <w:r>
               <w:rPr>
@@ -4188,8 +4179,9 @@
           <w:sz w:val="19"/>
           <w:szCs w:val="19"/>
         </w:rPr>
-        <w:t>{{commissionRate}}</w:t>
-      </w:r>
+        <w:t>{{</w:t>
+      </w:r>
+      <w:proofErr w:type="spellStart"/>
       <w:r>
         <w:rPr>
           <w:rFonts w:ascii="Tahoma" w:hAnsi="Tahoma" w:cs="Tahoma"/>
@@ -4198,6 +4190,27 @@
           <w:sz w:val="19"/>
           <w:szCs w:val="19"/>
         </w:rPr>
+        <w:t>commissionRate</w:t>
+      </w:r>
+      <w:proofErr w:type="spellEnd"/>
+      <w:r>
+        <w:rPr>
+          <w:rFonts w:ascii="Tahoma" w:hAnsi="Tahoma" w:cs="Tahoma"/>
+          <w:b/>
+          <w:bCs/>
+          <w:sz w:val="19"/>
+          <w:szCs w:val="19"/>
+        </w:rPr>
+        <w:t>}}</w:t>
+      </w:r>
+      <w:r>
+        <w:rPr>
+          <w:rFonts w:ascii="Tahoma" w:hAnsi="Tahoma" w:cs="Tahoma"/>
+          <w:b/>
+          <w:bCs/>
+          <w:sz w:val="19"/>
+          <w:szCs w:val="19"/>
+        </w:rPr>
         <w:t xml:space="preserve"> </w:t>
       </w:r>
       <w:r>
@@ -4218,7 +4231,29 @@
           <w:sz w:val="19"/>
           <w:szCs w:val="19"/>
         </w:rPr>
-        <w:t> {{commissionAmount}}</w:t>
+        <w:t> {{</w:t>
+      </w:r>
+      <w:proofErr w:type="spellStart"/>
+      <w:r>
+        <w:rPr>
+          <w:rFonts w:ascii="Tahoma" w:hAnsi="Tahoma" w:cs="Tahoma"/>
+          <w:b/>
+          <w:bCs/>
+          <w:sz w:val="19"/>
+          <w:szCs w:val="19"/>
+        </w:rPr>
+        <w:t>commissionAmount</w:t>
+      </w:r>
+      <w:proofErr w:type="spellEnd"/>
+      <w:r>
+        <w:rPr>
+          <w:rFonts w:ascii="Tahoma" w:hAnsi="Tahoma" w:cs="Tahoma"/>
+          <w:b/>
+          <w:bCs/>
+          <w:sz w:val="19"/>
+          <w:szCs w:val="19"/>
+        </w:rPr>
+        <w:t>}}</w:t>
       </w:r>
       <w:r>
         <w:rPr>
@@ -14951,6 +14986,7 @@
   <w:style w:type="character" w:default="1" w:styleId="DefaultParagraphFont">
     <w:name w:val="Default Paragraph Font"/>
     <w:uiPriority w:val="1"/>
+    <w:semiHidden/>
     <w:unhideWhenUsed/>
   </w:style>
   <w:style w:type="table" w:default="1" w:styleId="TableNormal">

</xml_diff>